<commit_message>
Add regenerated project outputs
</commit_message>
<xml_diff>
--- a/WrittenReportDraft.docx
+++ b/WrittenReportDraft.docx
@@ -57,11 +57,7 @@
         <w:ind w:firstLine="720"/>
       </w:pPr>
       <w:r>
-        <w:t xml:space="preserve">This paper presents a merged and revised analysis of binary sentiment classification on noisy Twitter text using the Sentiment140 corpus. The empirical core compares TF-IDF plus Logistic Regression, TF-IDF plus Linear SVM, a TF-IDF to TruncatedSVD to MLP baseline, and an LSTM sequence model on a shared 80/10/10 split (1,280,000 training tweets, 160,000 validation tweets, and 160,000 test tweets). Across the full test set, the LSTM achieved the strongest performance (accuracy = 0.81745, macro F1 = 0.817416, ROC-AUC = 0.899443), exceeding Logistic Regression (macro F1 = 0.800841) and Linear SVM (macro F1 = 0.800359). On the high-noise subset of 34,445 tweets, the LSTM remained strongest (macro F1 = 0.791648). This merged version strengthens the paper by integrating confidence interval analysis, a rigorous discussion of statistical significance, transformer baseline context, and improved figure integration. Approximate 95% confidence intervals for accuracy suggest that the LSTM's advantage over the strongest classical baselines is unlikely to be due to sampling variation alone, although paired significance testing could not be performed because raw prediction outputs were unavailable. The results support a nuanced conclusion: sequence </w:t>
-      </w:r>
-      <w:r>
-        <w:lastRenderedPageBreak/>
-        <w:t>modeling improves robustness under noisy conditions, but strong linear baselines remain highly competitive and dramatically more efficient. The paper concludes that the most compelling next step is to preserve the current controlled design while extending evaluation to tweet-native transformer baselines such as BERTweet and DistilBERT.</w:t>
+        <w:t>This paper presents a merged and revised analysis of binary sentiment classification on noisy Twitter text using the Sentiment140 corpus. The empirical core compares TF-IDF plus Logistic Regression, TF-IDF plus Linear SVM, a TF-IDF to TruncatedSVD to MLP baseline, and an LSTM sequence model on a shared 80/10/10 split (1,280,000 training tweets, 160,000 validation tweets, and 160,000 test tweets). Across the full test set, the LSTM achieved the strongest performance (accuracy = 0.81745, macro F1 = 0.817416, ROC-AUC = 0.899443), exceeding Logistic Regression (macro F1 = 0.800841) and Linear SVM (macro F1 = 0.800359). On the high-noise subset of 34,445 tweets, the LSTM remained strongest (macro F1 = 0.791648). This merged version strengthens the paper by integrating confidence interval analysis, paired McNemar significance testing, transformer baseline context, and improved figure integration. Approximate 95% confidence intervals for accuracy and paired McNemar comparisons both support the interpretation that the LSTM's advantage over the strongest classical baselines is unlikely to be due to sampling variation alone. The results support a nuanced conclusion: sequence modeling improves robustness under noisy conditions, but strong linear baselines remain highly competitive and dramatically more efficient. The paper concludes that the most compelling next step is to preserve the current controlled design while extending evaluation to tweet-native transformer baselines such as BERTweet and DistilBERT.</w:t>
       </w:r>
     </w:p>
     <w:p>
@@ -405,15 +401,8 @@
             <w:vAlign w:val="center"/>
           </w:tcPr>
           <w:p>
-            <w:pPr>
-              <w:spacing w:line="480" w:lineRule="auto"/>
-              <w:jc w:val="center"/>
-            </w:pPr>
             <w:r>
-              <w:rPr>
-                <w:sz w:val="20"/>
-              </w:rPr>
-              <w:t>6.079</w:t>
+              <w:t>13.652</w:t>
             </w:r>
           </w:p>
         </w:tc>
@@ -423,15 +412,8 @@
             <w:vAlign w:val="center"/>
           </w:tcPr>
           <w:p>
-            <w:pPr>
-              <w:spacing w:line="480" w:lineRule="auto"/>
-              <w:jc w:val="center"/>
-            </w:pPr>
             <w:r>
-              <w:rPr>
-                <w:sz w:val="20"/>
-              </w:rPr>
-              <w:t>66,005,484</w:t>
+              <w:t>41,539,560</w:t>
             </w:r>
           </w:p>
         </w:tc>
@@ -536,15 +518,8 @@
             <w:vAlign w:val="center"/>
           </w:tcPr>
           <w:p>
-            <w:pPr>
-              <w:spacing w:line="480" w:lineRule="auto"/>
-              <w:jc w:val="center"/>
-            </w:pPr>
             <w:r>
-              <w:rPr>
-                <w:sz w:val="20"/>
-              </w:rPr>
-              <w:t>6.140</w:t>
+              <w:t>12.869</w:t>
             </w:r>
           </w:p>
         </w:tc>
@@ -554,15 +529,8 @@
             <w:vAlign w:val="center"/>
           </w:tcPr>
           <w:p>
-            <w:pPr>
-              <w:spacing w:line="480" w:lineRule="auto"/>
-              <w:jc w:val="center"/>
-            </w:pPr>
             <w:r>
-              <w:rPr>
-                <w:sz w:val="20"/>
-              </w:rPr>
-              <w:t>62,359,934</w:t>
+              <w:t>37,330,120</w:t>
             </w:r>
           </w:p>
         </w:tc>
@@ -667,15 +635,8 @@
             <w:vAlign w:val="center"/>
           </w:tcPr>
           <w:p>
-            <w:pPr>
-              <w:spacing w:line="480" w:lineRule="auto"/>
-              <w:jc w:val="center"/>
-            </w:pPr>
             <w:r>
-              <w:rPr>
-                <w:sz w:val="20"/>
-              </w:rPr>
-              <w:t>10.835</w:t>
+              <w:t>20.244</w:t>
             </w:r>
           </w:p>
         </w:tc>
@@ -685,15 +646,8 @@
             <w:vAlign w:val="center"/>
           </w:tcPr>
           <w:p>
-            <w:pPr>
-              <w:spacing w:line="480" w:lineRule="auto"/>
-              <w:jc w:val="center"/>
-            </w:pPr>
             <w:r>
-              <w:rPr>
-                <w:sz w:val="20"/>
-              </w:rPr>
-              <w:t>1,942,898</w:t>
+              <w:t>936,697</w:t>
             </w:r>
           </w:p>
         </w:tc>
@@ -798,15 +752,8 @@
             <w:vAlign w:val="center"/>
           </w:tcPr>
           <w:p>
-            <w:pPr>
-              <w:spacing w:line="480" w:lineRule="auto"/>
-              <w:jc w:val="center"/>
-            </w:pPr>
             <w:r>
-              <w:rPr>
-                <w:sz w:val="20"/>
-              </w:rPr>
-              <w:t>307.742</w:t>
+              <w:t>529.033</w:t>
             </w:r>
           </w:p>
         </w:tc>
@@ -816,15 +763,8 @@
             <w:vAlign w:val="center"/>
           </w:tcPr>
           <w:p>
-            <w:pPr>
-              <w:spacing w:line="480" w:lineRule="auto"/>
-              <w:jc w:val="center"/>
-            </w:pPr>
             <w:r>
-              <w:rPr>
-                <w:sz w:val="20"/>
-              </w:rPr>
-              <w:t>37,849</w:t>
+              <w:t>29,269</w:t>
             </w:r>
           </w:p>
         </w:tc>
@@ -848,8 +788,7 @@
         <w:ind w:firstLine="720"/>
       </w:pPr>
       <w:r>
-        <w:lastRenderedPageBreak/>
-        <w:t>The LSTM improved macro F1 over Logistic Regression by 0.016575 on the full test set and by 0.021205 on the high-noise subset. At the same time, it required 307.742 seconds of training compared with 6.079 seconds for Logistic Regression, revealing a substantial accuracy-efficiency trade-off rather than an overwhelming dominance of neural modeling.</w:t>
+        <w:t>The LSTM improved macro F1 over Logistic Regression by 0.016575 on the full test set and by 0.021205 on the high-noise subset. At the same time, the regenerated notebook run required 529.033 seconds of training for the LSTM compared with 13.652 seconds for Logistic Regression, revealing a substantial accuracy-efficiency trade-off rather than an overwhelming dominance of neural modeling.</w:t>
       </w:r>
     </w:p>
     <w:p>
@@ -1316,8 +1255,7 @@
         <w:ind w:firstLine="720"/>
       </w:pPr>
       <w:r>
-        <w:lastRenderedPageBreak/>
-        <w:t>The LSTM interval does not overlap the intervals for Logistic Regression or Linear SVM. While this is not a substitute for paired testing on identical prediction vectors, it supports the interpretation that the LSTM's full-test accuracy advantage is unlikely to be explained by random sampling variation alone.</w:t>
+        <w:t>The LSTM interval does not overlap the intervals for Logistic Regression or Linear SVM. This supports the interpretation that the LSTM's full-test accuracy advantage is unlikely to be explained by random sampling variation alone.</w:t>
       </w:r>
     </w:p>
     <w:p>
@@ -1326,7 +1264,7 @@
         <w:ind w:firstLine="720"/>
       </w:pPr>
       <w:r>
-        <w:t>A stricter significance analysis would ordinarily use a paired test such as McNemar's test, because the models are evaluated on the same examples and the question of interest is whether they differ on exactly which tweets they classify correctly. That analysis could not be performed here because raw prediction-level outputs were not available in the uploaded artifacts. Accordingly, the present paper interprets significance cautiously: the results are suggestive and likely meaningful, but not proven through paired inferential testing.</w:t>
+        <w:t>Because all models were evaluated on the same held-out tweets, the notebook also performs paired McNemar comparisons on the full-test prediction vectors. The LSTM differed significantly from Logistic Regression (continuity-corrected chi-square = 400.622, approximate p = 4.03e-89) and Linear SVM (chi-square = 416.700, approximate p = 1.28e-92). Logistic Regression and Linear SVM, by contrast, were not clearly separable under the same paired test (approximate p = 0.0596). These paired results strengthen the conclusion that the LSTM's advantage is real, while the two classical linear baselines are effectively comparable.</w:t>
       </w:r>
     </w:p>
     <w:p>
@@ -1402,11 +1340,7 @@
         <w:ind w:firstLine="720"/>
       </w:pPr>
       <w:r>
-        <w:t xml:space="preserve">The study also remains appropriately cautious about what it can and cannot claim. Its robustness analysis is meaningful because the high-noise subset covers a substantial fraction of the test set, but the project artifacts also note that emoji coverage is too limited to support strong </w:t>
-      </w:r>
-      <w:r>
-        <w:lastRenderedPageBreak/>
-        <w:t>claims about emoji robustness. Similarly, the significance discussion is strengthened by confidence interval analysis, but not completed, because paired prediction outputs were unavailable.</w:t>
+        <w:t>The study also remains appropriately cautious about what it can and cannot claim. Its robustness analysis is meaningful because the high-noise subset covers a substantial fraction of the test set, but the project artifacts also note that emoji coverage is too limited to support strong claims about emoji robustness. The significance discussion is stronger after adding raw prediction exports and paired McNemar tests, but the transformer comparison remains future work rather than an implemented experimental result.</w:t>
       </w:r>
     </w:p>
     <w:p>
@@ -1433,7 +1367,7 @@
         <w:ind w:firstLine="720"/>
       </w:pPr>
       <w:r>
-        <w:t>The best-supported conclusion is that sequence modeling improves performance on noisy Twitter sentiment classification, especially on harder noisy slices, but only by a modest margin relative to the remarkable efficiency of strong linear baselines. The most compelling next step is to preserve the current controlled comparison while adding tweet-native transformer baselines such as BERTweet or DistilBERT and, if prediction outputs are available, paired statistical significance testing.</w:t>
+        <w:t>The best-supported conclusion is that sequence modeling improves performance on noisy Twitter sentiment classification, especially on harder noisy slices, but only by a modest margin relative to the remarkable efficiency of strong linear baselines. The most compelling next step is to preserve the current controlled comparison while adding tweet-native transformer baselines such as BERTweet or DistilBERT.</w:t>
       </w:r>
     </w:p>
     <w:p>

</xml_diff>